<commit_message>
Make guide and blog language-neutral and mark Java as the tested example
</commit_message>
<xml_diff>
--- a/blog/capella-cpu-alerts-appdynamics.docx
+++ b/blog/capella-cpu-alerts-appdynamics.docx
@@ -80,7 +80,7 @@
                 <w:sz w:val="22"/>
                 <w:szCs w:val="22"/>
               </w:rPr>
-              <w:t xml:space="preserve">A practical setup for Java applications, with every command</w:t>
+              <w:t xml:space="preserve">A practical setup, with every command  ·  example application: Java</w:t>
             </w:r>
           </w:p>
         </w:tc>
@@ -102,8 +102,75 @@
           <w:sz w:val="21"/>
           <w:szCs w:val="21"/>
         </w:rPr>
-        <w:t xml:space="preserve">Capella is a managed database, so you cannot install an AppDynamics agent on its nodes. That raises a practical question: how do you see Capella from AppDynamics, and how do you get an email when a Capella metric crosses a limit? This post shows a setup that works with the Java agent and the Machine Agent, including the common pitfalls. We use CPU as the first test metric; any metric on Capella's metrics endpoint works the same way.</w:t>
-      </w:r>
+        <w:t xml:space="preserve">Capella is a managed database, so you cannot install an AppDynamics agent on its nodes. That raises a practical question: how do you see Capella from AppDynamics, and how do you get an email when a Capella metric crosses a limit? This post shows a setup with an AppDynamics agent in the application and the Machine Agent, including the common pitfalls. We use CPU as the first test metric; any metric on Capella's metrics endpoint works the same way.</w:t>
+      </w:r>
+    </w:p>
+    <w:tbl>
+      <w:tblPr>
+        <w:tblW w:type="dxa" w:w="10080"/>
+        <w:tblBorders>
+          <w:top w:val="single" w:color="auto" w:sz="4"/>
+          <w:left w:val="single" w:color="auto" w:sz="4"/>
+          <w:bottom w:val="single" w:color="auto" w:sz="4"/>
+          <w:right w:val="single" w:color="auto" w:sz="4"/>
+          <w:insideH w:val="single" w:color="auto" w:sz="4"/>
+          <w:insideV w:val="single" w:color="auto" w:sz="4"/>
+        </w:tblBorders>
+        <w:tblLayout w:type="fixed"/>
+      </w:tblPr>
+      <w:tblGrid>
+        <w:gridCol w:w="10080"/>
+      </w:tblGrid>
+      <w:tr>
+        <w:tc>
+          <w:tcPr>
+            <w:tcW w:type="dxa" w:w="10080"/>
+            <w:tcBorders>
+              <w:top w:val="none" w:color="FFFFFF" w:sz="0"/>
+              <w:left w:val="single" w:color="2563EB" w:sz="30"/>
+              <w:bottom w:val="none" w:color="FFFFFF" w:sz="0"/>
+              <w:right w:val="none" w:color="FFFFFF" w:sz="0"/>
+            </w:tcBorders>
+            <w:shd w:fill="EAF1FF" w:val="clear"/>
+            <w:tcMar>
+              <w:top w:type="dxa" w:w="120"/>
+              <w:left w:type="dxa" w:w="220"/>
+              <w:bottom w:type="dxa" w:w="120"/>
+              <w:right w:type="dxa" w:w="200"/>
+            </w:tcMar>
+          </w:tcPr>
+          <w:p>
+            <w:pPr>
+              <w:spacing w:after="0" w:line="276"/>
+            </w:pPr>
+            <w:r>
+              <w:rPr>
+                <w:rFonts w:ascii="Arial" w:cs="Arial" w:eastAsia="Arial" w:hAnsi="Arial"/>
+                <w:b/>
+                <w:bCs/>
+                <w:color w:val="172033"/>
+                <w:sz w:val="21"/>
+                <w:szCs w:val="21"/>
+              </w:rPr>
+              <w:t xml:space="preserve">Language note.</w:t>
+            </w:r>
+            <w:r>
+              <w:rPr>
+                <w:rFonts w:ascii="Arial" w:cs="Arial" w:eastAsia="Arial" w:hAnsi="Arial"/>
+                <w:color w:val="172033"/>
+                <w:sz w:val="21"/>
+                <w:szCs w:val="21"/>
+              </w:rPr>
+              <w:t xml:space="preserve"> Steps 1 and 2 use a Java application, the language we tested. For another language, use that language's Couchbase SDK and AppDynamics agent; only the code differs. Steps 3 to 6 are the same for every language, because they do not touch the application.</w:t>
+            </w:r>
+          </w:p>
+        </w:tc>
+      </w:tr>
+    </w:tbl>
+    <w:p>
+      <w:pPr>
+        <w:spacing w:after="160" w:before="0"/>
+      </w:pPr>
     </w:p>
     <w:p>
       <w:pPr>
@@ -169,7 +236,7 @@
           <w:sz w:val="21"/>
           <w:szCs w:val="21"/>
         </w:rPr>
-        <w:t xml:space="preserve"> The Java agent watches your app's calls to Capella: latency, calls per minute and errors.</w:t>
+        <w:t xml:space="preserve"> An AppDynamics agent inside your application watches its calls to Capella: latency, calls per minute and errors.</w:t>
       </w:r>
     </w:p>
     <w:p>
@@ -290,21 +357,21 @@
                 <w:sz w:val="17"/>
                 <w:szCs w:val="17"/>
               </w:rPr>
-              <w:t xml:space="preserve">Java app --TLS--&gt; Capella</w:t>
-            </w:r>
-          </w:p>
-          <w:p>
-            <w:pPr>
-              <w:spacing w:after="0" w:before="0" w:line="252"/>
-            </w:pPr>
-            <w:r>
-              <w:rPr>
-                <w:rFonts w:ascii="Courier New" w:cs="Courier New" w:eastAsia="Courier New" w:hAnsi="Courier New"/>
-                <w:color w:val="E6EDF7"/>
-                <w:sz w:val="17"/>
-                <w:szCs w:val="17"/>
-              </w:rPr>
-              <w:t xml:space="preserve">   | Java agent</w:t>
+              <w:t xml:space="preserve">Your app --TLS--&gt; Capella</w:t>
+            </w:r>
+          </w:p>
+          <w:p>
+            <w:pPr>
+              <w:spacing w:after="0" w:before="0" w:line="252"/>
+            </w:pPr>
+            <w:r>
+              <w:rPr>
+                <w:rFonts w:ascii="Courier New" w:cs="Courier New" w:eastAsia="Courier New" w:hAnsi="Courier New"/>
+                <w:color w:val="E6EDF7"/>
+                <w:sz w:val="17"/>
+                <w:szCs w:val="17"/>
+              </w:rPr>
+              <w:t xml:space="preserve">   | AppDynamics agent</w:t>
             </w:r>
           </w:p>
           <w:p>
@@ -464,7 +531,7 @@
           <w:sz w:val="21"/>
           <w:szCs w:val="21"/>
         </w:rPr>
-        <w:t xml:space="preserve">A Java application on the Couchbase Java SDK 3.x, and a Linux or macOS host for the Machine Agent.</w:t>
+        <w:t xml:space="preserve">An application that uses a Couchbase SDK (we used Java with the Java SDK 3.x), and a Linux or macOS host for the Machine Agent.</w:t>
       </w:r>
     </w:p>
     <w:p>
@@ -618,7 +685,7 @@
                 <w:sz w:val="20"/>
                 <w:szCs w:val="20"/>
               </w:rPr>
-              <w:t xml:space="preserve">AppDynamics Java Agent (ZIP)</w:t>
+              <w:t xml:space="preserve">AppDynamics agent for your language (we used the Java Agent ZIP)</w:t>
             </w:r>
           </w:p>
         </w:tc>
@@ -837,7 +904,7 @@
                 <w:sz w:val="20"/>
                 <w:szCs w:val="20"/>
               </w:rPr>
-              <w:t xml:space="preserve">Couchbase Java SDK 3.x</w:t>
+              <w:t xml:space="preserve">Couchbase SDK for your language (we used Java SDK 3.x)</w:t>
             </w:r>
           </w:p>
         </w:tc>
@@ -870,7 +937,7 @@
                 <w:sz w:val="20"/>
                 <w:szCs w:val="20"/>
               </w:rPr>
-              <w:t xml:space="preserve">Maven Central, pulled in by your build tool</w:t>
+              <w:t xml:space="preserve">Your package manager, for example Maven Central</w:t>
             </w:r>
           </w:p>
         </w:tc>
@@ -1012,7 +1079,7 @@
           <w:sz w:val="21"/>
           <w:szCs w:val="21"/>
         </w:rPr>
-        <w:t xml:space="preserve">Capella's certificate chain is rooted in a Couchbase CA that Java and curl do not trust by default. You will see </w:t>
+        <w:t xml:space="preserve">Capella's certificate chain is rooted in a Couchbase CA that SDKs and curl do not trust by default. You will see </w:t>
       </w:r>
       <w:r>
         <w:rPr>
@@ -1470,7 +1537,7 @@
           <w:sz w:val="21"/>
           <w:szCs w:val="21"/>
         </w:rPr>
-        <w:t xml:space="preserve">Attach the Java agent. The controller host must be a bare hostname with no </w:t>
+        <w:t xml:space="preserve">Attach the AppDynamics agent (Java shown). The controller host must be a bare hostname with no </w:t>
       </w:r>
       <w:r>
         <w:rPr>
@@ -1998,7 +2065,7 @@
                 <w:sz w:val="21"/>
                 <w:szCs w:val="21"/>
               </w:rPr>
-              <w:t xml:space="preserve"> AppDynamics only records Couchbase calls inside a business transaction. Web apps get one per request. A plain Java program has none, so put the work in one method and add a POJO rule (Applications, your app, Configuration, Instrumentation, Transaction Detection, Rules, Add: Custom Match Rule, Java, POJO, class equals your class, method equals </w:t>
+              <w:t xml:space="preserve"> AppDynamics only records Couchbase calls inside a business transaction. Web apps get one per request. A standalone program has none, so put the work in one method and add a POJO rule (Applications, your app, Configuration, Instrumentation, Transaction Detection, Rules, Add: Custom Match Rule, Java, POJO, class equals your class, method equals </w:t>
             </w:r>
             <w:r>
               <w:rPr>
@@ -6398,7 +6465,7 @@
           <w:sz w:val="21"/>
           <w:szCs w:val="21"/>
         </w:rPr>
-        <w:t xml:space="preserve">Test the script, then start the Machine Agent with the same application, tier and node names as the Java agent:</w:t>
+        <w:t xml:space="preserve">Test the script, then start the Machine Agent with the same application, tier and node names as the application's agent:</w:t>
       </w:r>
     </w:p>
     <w:tbl>
@@ -8786,7 +8853,7 @@
           <w:sz w:val="21"/>
           <w:szCs w:val="21"/>
         </w:rPr>
-        <w:t xml:space="preserve">A plain Java program shows 0 calls until you add a business transaction.</w:t>
+        <w:t xml:space="preserve">A standalone program shows 0 calls until you add a business transaction.</w:t>
       </w:r>
     </w:p>
     <w:p>

</xml_diff>